<commit_message>
Updated ERD added to Final word doc
</commit_message>
<xml_diff>
--- a/FINAL WORD DOCUMENT/Hamdan_And_Hudaibia_Version_Control_DB_Lab.docx
+++ b/FINAL WORD DOCUMENT/Hamdan_And_Hudaibia_Version_Control_DB_Lab.docx
@@ -155,31 +155,7 @@
         <w:rPr>
           <w:rFonts w:ascii="Times" w:hAnsi="Times" w:cs="Times"/>
         </w:rPr>
-        <w:t>V1.0</w:t>
-      </w:r>
-      <w:r>
-        <w:rPr>
-          <w:rFonts w:ascii="Times" w:hAnsi="Times" w:cs="Times"/>
-        </w:rPr>
-        <w:t xml:space="preserve"> </w:t>
-      </w:r>
-      <w:r>
-        <w:rPr>
-          <w:rFonts w:ascii="Times" w:hAnsi="Times" w:cs="Times"/>
-        </w:rPr>
-        <w:t xml:space="preserve"> </w:t>
-      </w:r>
-      <w:r>
-        <w:rPr>
-          <w:rFonts w:ascii="Times" w:hAnsi="Times" w:cs="Times"/>
-        </w:rPr>
-        <w:t xml:space="preserve"> </w:t>
-      </w:r>
-      <w:r>
-        <w:rPr>
-          <w:rFonts w:ascii="Times" w:hAnsi="Times" w:cs="Times"/>
-        </w:rPr>
-        <w:t xml:space="preserve">  </w:t>
+        <w:t xml:space="preserve">V1.0     </w:t>
       </w:r>
       <w:r>
         <w:rPr>
@@ -2585,6 +2561,9 @@
     <w:p>
       <w:pPr>
         <w:spacing w:after="240"/>
+        <w:rPr>
+          <w:rFonts w:ascii="Times" w:hAnsi="Times" w:cs="Times"/>
+        </w:rPr>
       </w:pPr>
       <w:r>
         <w:rPr>
@@ -2595,6 +2574,110 @@
     </w:p>
     <w:p>
       <w:pPr>
+        <w:spacing w:after="240"/>
+        <w:rPr>
+          <w:rFonts w:ascii="Times" w:hAnsi="Times" w:cs="Times"/>
+        </w:rPr>
+      </w:pPr>
+    </w:p>
+    <w:p>
+      <w:pPr>
+        <w:spacing w:after="240"/>
+        <w:rPr>
+          <w:rFonts w:ascii="Times" w:hAnsi="Times" w:cs="Times"/>
+          <w:b/>
+          <w:bCs/>
+          <w:i/>
+          <w:iCs/>
+          <w:sz w:val="36"/>
+          <w:szCs w:val="36"/>
+          <w:u w:val="single"/>
+        </w:rPr>
+      </w:pPr>
+      <w:r>
+        <w:rPr>
+          <w:rFonts w:ascii="Times" w:hAnsi="Times" w:cs="Times"/>
+          <w:b/>
+          <w:bCs/>
+          <w:i/>
+          <w:iCs/>
+          <w:sz w:val="36"/>
+          <w:szCs w:val="36"/>
+          <w:u w:val="single"/>
+        </w:rPr>
+        <w:t>UPDATED ERD:</w:t>
+      </w:r>
+    </w:p>
+    <w:p>
+      <w:pPr>
+        <w:spacing w:after="240"/>
+        <w:rPr>
+          <w:b/>
+          <w:bCs/>
+          <w:i/>
+          <w:iCs/>
+          <w:sz w:val="36"/>
+          <w:szCs w:val="36"/>
+          <w:u w:val="single"/>
+        </w:rPr>
+      </w:pPr>
+      <w:r>
+        <w:rPr>
+          <w:b/>
+          <w:bCs/>
+          <w:i/>
+          <w:iCs/>
+          <w:noProof/>
+          <w:sz w:val="36"/>
+          <w:szCs w:val="36"/>
+          <w:u w:val="single"/>
+        </w:rPr>
+        <w:lastRenderedPageBreak/>
+        <w:drawing>
+          <wp:inline distT="0" distB="0" distL="0" distR="0">
+            <wp:extent cx="4564380" cy="8863330"/>
+            <wp:effectExtent l="0" t="0" r="0" b="1270"/>
+            <wp:docPr id="67631649" name="Picture 1"/>
+            <wp:cNvGraphicFramePr>
+              <a:graphicFrameLocks xmlns:a="http://schemas.openxmlformats.org/drawingml/2006/main" noChangeAspect="1"/>
+            </wp:cNvGraphicFramePr>
+            <a:graphic xmlns:a="http://schemas.openxmlformats.org/drawingml/2006/main">
+              <a:graphicData uri="http://schemas.openxmlformats.org/drawingml/2006/picture">
+                <pic:pic xmlns:pic="http://schemas.openxmlformats.org/drawingml/2006/picture">
+                  <pic:nvPicPr>
+                    <pic:cNvPr id="67631649" name="Picture 67631649"/>
+                    <pic:cNvPicPr/>
+                  </pic:nvPicPr>
+                  <pic:blipFill>
+                    <a:blip r:embed="rId6">
+                      <a:extLst>
+                        <a:ext uri="{28A0092B-C50C-407E-A947-70E740481C1C}">
+                          <a14:useLocalDpi xmlns:a14="http://schemas.microsoft.com/office/drawing/2010/main" val="0"/>
+                        </a:ext>
+                      </a:extLst>
+                    </a:blip>
+                    <a:stretch>
+                      <a:fillRect/>
+                    </a:stretch>
+                  </pic:blipFill>
+                  <pic:spPr>
+                    <a:xfrm>
+                      <a:off x="0" y="0"/>
+                      <a:ext cx="4564380" cy="8863330"/>
+                    </a:xfrm>
+                    <a:prstGeom prst="rect">
+                      <a:avLst/>
+                    </a:prstGeom>
+                  </pic:spPr>
+                </pic:pic>
+              </a:graphicData>
+            </a:graphic>
+          </wp:inline>
+        </w:drawing>
+      </w:r>
+    </w:p>
+    <w:p>
+      <w:pPr>
         <w:spacing w:after="321"/>
       </w:pPr>
       <w:r>
@@ -2603,6 +2686,7 @@
           <w:b/>
           <w:sz w:val="48"/>
         </w:rPr>
+        <w:lastRenderedPageBreak/>
         <w:t>Milestone 3: Dataset Preprocessing &amp; Dataflow</w:t>
       </w:r>
     </w:p>
@@ -2849,76 +2933,354 @@
           <w:rFonts w:ascii="Times" w:hAnsi="Times" w:cs="Times"/>
           <w:b/>
         </w:rPr>
+        <w:tab/>
+        <w:t>•</w:t>
+      </w:r>
+      <w:r>
+        <w:rPr>
+          <w:rFonts w:ascii="Times" w:hAnsi="Times" w:cs="Times"/>
+          <w:b/>
+        </w:rPr>
+        <w:tab/>
+        <w:t>Customer &amp; Vehicle Intake</w:t>
+      </w:r>
+      <w:r>
+        <w:rPr>
+          <w:rFonts w:ascii="Times" w:hAnsi="Times" w:cs="Times"/>
+        </w:rPr>
+        <w:t xml:space="preserve">: A front-desk employee enters the customer's personal details into the </w:t>
+      </w:r>
+      <w:r>
+        <w:rPr>
+          <w:rFonts w:ascii="Courier" w:hAnsi="Courier" w:cs="Courier"/>
+          <w:sz w:val="26"/>
+        </w:rPr>
+        <w:t>CUSTOMER</w:t>
+      </w:r>
+      <w:r>
+        <w:rPr>
+          <w:rFonts w:ascii="Times" w:hAnsi="Times" w:cs="Times"/>
+        </w:rPr>
+        <w:t xml:space="preserve"> table. Following this, the vehicle details are registered into the </w:t>
+      </w:r>
+      <w:r>
+        <w:rPr>
+          <w:rFonts w:ascii="Courier" w:hAnsi="Courier" w:cs="Courier"/>
+          <w:sz w:val="26"/>
+        </w:rPr>
+        <w:t>VEHICLE</w:t>
+      </w:r>
+      <w:r>
+        <w:rPr>
+          <w:rFonts w:ascii="Times" w:hAnsi="Times" w:cs="Times"/>
+        </w:rPr>
+        <w:t xml:space="preserve"> table.</w:t>
+      </w:r>
+    </w:p>
+    <w:p>
+      <w:pPr>
+        <w:ind w:left="720"/>
+      </w:pPr>
+      <w:r>
+        <w:rPr>
+          <w:rFonts w:ascii="Times" w:hAnsi="Times" w:cs="Times"/>
+          <w:b/>
+        </w:rPr>
+        <w:tab/>
+        <w:t>•</w:t>
+      </w:r>
+      <w:r>
+        <w:rPr>
+          <w:rFonts w:ascii="Times" w:hAnsi="Times" w:cs="Times"/>
+          <w:b/>
+        </w:rPr>
+        <w:tab/>
+        <w:t>Inventory Restocking</w:t>
+      </w:r>
+      <w:r>
+        <w:rPr>
+          <w:rFonts w:ascii="Times" w:hAnsi="Times" w:cs="Times"/>
+        </w:rPr>
+        <w:t xml:space="preserve">: The workshop manager enters parts data into the </w:t>
+      </w:r>
+      <w:r>
+        <w:rPr>
+          <w:rFonts w:ascii="Courier" w:hAnsi="Courier" w:cs="Courier"/>
+          <w:sz w:val="26"/>
+        </w:rPr>
+        <w:t>SPARE_PART</w:t>
+      </w:r>
+      <w:r>
+        <w:rPr>
+          <w:rFonts w:ascii="Times" w:hAnsi="Times" w:cs="Times"/>
+        </w:rPr>
+        <w:t xml:space="preserve"> table.</w:t>
+      </w:r>
+    </w:p>
+    <w:p>
+      <w:pPr>
+        <w:ind w:left="720"/>
+      </w:pPr>
+      <w:r>
+        <w:rPr>
+          <w:rFonts w:ascii="Times" w:hAnsi="Times" w:cs="Times"/>
+          <w:b/>
+        </w:rPr>
+        <w:tab/>
+        <w:t>•</w:t>
+      </w:r>
+      <w:r>
+        <w:rPr>
+          <w:rFonts w:ascii="Times" w:hAnsi="Times" w:cs="Times"/>
+          <w:b/>
+        </w:rPr>
+        <w:tab/>
+        <w:t>Mechanic Onboarding</w:t>
+      </w:r>
+      <w:r>
+        <w:rPr>
+          <w:rFonts w:ascii="Times" w:hAnsi="Times" w:cs="Times"/>
+        </w:rPr>
+        <w:t xml:space="preserve">: Administration inputs employee data into the </w:t>
+      </w:r>
+      <w:r>
+        <w:rPr>
+          <w:rFonts w:ascii="Courier" w:hAnsi="Courier" w:cs="Courier"/>
+          <w:sz w:val="26"/>
+        </w:rPr>
+        <w:t>MECHANIC</w:t>
+      </w:r>
+      <w:r>
+        <w:rPr>
+          <w:rFonts w:ascii="Times" w:hAnsi="Times" w:cs="Times"/>
+        </w:rPr>
+        <w:t xml:space="preserve"> table.</w:t>
+      </w:r>
+    </w:p>
+    <w:p>
+      <w:pPr>
+        <w:spacing w:after="280"/>
+      </w:pPr>
+      <w:r>
+        <w:rPr>
+          <w:rFonts w:ascii="Times" w:hAnsi="Times" w:cs="Times"/>
+          <w:b/>
+          <w:sz w:val="28"/>
+        </w:rPr>
+        <w:t>2. Data Movement &amp; Processing (Throughput)</w:t>
+      </w:r>
+    </w:p>
+    <w:p>
+      <w:pPr>
+        <w:ind w:left="720"/>
+      </w:pPr>
+      <w:r>
+        <w:rPr>
+          <w:rFonts w:ascii="Times" w:hAnsi="Times" w:cs="Times"/>
+          <w:b/>
+        </w:rPr>
+        <w:tab/>
+        <w:t>•</w:t>
+      </w:r>
+      <w:r>
+        <w:rPr>
+          <w:rFonts w:ascii="Times" w:hAnsi="Times" w:cs="Times"/>
+          <w:b/>
+        </w:rPr>
+        <w:tab/>
+        <w:t>Service Job Creation</w:t>
+      </w:r>
+      <w:r>
+        <w:rPr>
+          <w:rFonts w:ascii="Times" w:hAnsi="Times" w:cs="Times"/>
+        </w:rPr>
+        <w:t xml:space="preserve">: A new record is created in the </w:t>
+      </w:r>
+      <w:r>
+        <w:rPr>
+          <w:rFonts w:ascii="Courier" w:hAnsi="Courier" w:cs="Courier"/>
+          <w:sz w:val="26"/>
+        </w:rPr>
+        <w:t>SERVICE_JOB</w:t>
+      </w:r>
+      <w:r>
+        <w:rPr>
+          <w:rFonts w:ascii="Times" w:hAnsi="Times" w:cs="Times"/>
+        </w:rPr>
+        <w:t xml:space="preserve"> table when a vehicle is assigned to a mechanic.</w:t>
+      </w:r>
+    </w:p>
+    <w:p>
+      <w:pPr>
+        <w:ind w:left="720"/>
+      </w:pPr>
+      <w:r>
+        <w:rPr>
+          <w:rFonts w:ascii="Times" w:hAnsi="Times" w:cs="Times"/>
+          <w:b/>
+        </w:rPr>
+        <w:tab/>
+        <w:t>•</w:t>
+      </w:r>
+      <w:r>
+        <w:rPr>
+          <w:rFonts w:ascii="Times" w:hAnsi="Times" w:cs="Times"/>
+          <w:b/>
+        </w:rPr>
+        <w:tab/>
+        <w:t>Parts Consumption</w:t>
+      </w:r>
+      <w:r>
+        <w:rPr>
+          <w:rFonts w:ascii="Times" w:hAnsi="Times" w:cs="Times"/>
+        </w:rPr>
+        <w:t xml:space="preserve">: As the mechanic works, entries are logged in the </w:t>
+      </w:r>
+      <w:r>
+        <w:rPr>
+          <w:rFonts w:ascii="Courier" w:hAnsi="Courier" w:cs="Courier"/>
+          <w:sz w:val="26"/>
+        </w:rPr>
+        <w:t>SERVICE_PARTS</w:t>
+      </w:r>
+      <w:r>
+        <w:rPr>
+          <w:rFonts w:ascii="Times" w:hAnsi="Times" w:cs="Times"/>
+        </w:rPr>
+        <w:t xml:space="preserve"> junction table.</w:t>
+      </w:r>
+    </w:p>
+    <w:p>
+      <w:pPr>
+        <w:ind w:left="720"/>
+      </w:pPr>
+      <w:r>
+        <w:rPr>
+          <w:rFonts w:ascii="Times" w:hAnsi="Times" w:cs="Times"/>
+          <w:b/>
+        </w:rPr>
+        <w:tab/>
+        <w:t>•</w:t>
+      </w:r>
+      <w:r>
+        <w:rPr>
+          <w:rFonts w:ascii="Times" w:hAnsi="Times" w:cs="Times"/>
+          <w:b/>
+        </w:rPr>
+        <w:tab/>
+        <w:t>Labor Logging</w:t>
+      </w:r>
+      <w:r>
+        <w:rPr>
+          <w:rFonts w:ascii="Times" w:hAnsi="Times" w:cs="Times"/>
+        </w:rPr>
+        <w:t xml:space="preserve">: Upon job completion, the </w:t>
+      </w:r>
+      <w:r>
+        <w:rPr>
+          <w:rFonts w:ascii="Courier" w:hAnsi="Courier" w:cs="Courier"/>
+          <w:sz w:val="26"/>
+        </w:rPr>
+        <w:t>Status</w:t>
+      </w:r>
+      <w:r>
+        <w:rPr>
+          <w:rFonts w:ascii="Times" w:hAnsi="Times" w:cs="Times"/>
+        </w:rPr>
+        <w:t xml:space="preserve"> is changed to "Completed" and final </w:t>
+      </w:r>
+      <w:r>
+        <w:rPr>
+          <w:rFonts w:ascii="Courier" w:hAnsi="Courier" w:cs="Courier"/>
+          <w:sz w:val="26"/>
+        </w:rPr>
+        <w:t>LaborCost</w:t>
+      </w:r>
+      <w:r>
+        <w:rPr>
+          <w:rFonts w:ascii="Times" w:hAnsi="Times" w:cs="Times"/>
+        </w:rPr>
+        <w:t xml:space="preserve"> is logged.</w:t>
+      </w:r>
+    </w:p>
+    <w:p>
+      <w:pPr>
+        <w:spacing w:after="280"/>
+      </w:pPr>
+      <w:r>
+        <w:rPr>
+          <w:rFonts w:ascii="Times" w:hAnsi="Times" w:cs="Times"/>
+          <w:b/>
+          <w:sz w:val="28"/>
+        </w:rPr>
         <w:lastRenderedPageBreak/>
-        <w:tab/>
-        <w:t>•</w:t>
-      </w:r>
-      <w:r>
-        <w:rPr>
-          <w:rFonts w:ascii="Times" w:hAnsi="Times" w:cs="Times"/>
-          <w:b/>
-        </w:rPr>
-        <w:tab/>
-        <w:t>Customer &amp; Vehicle Intake</w:t>
-      </w:r>
-      <w:r>
-        <w:rPr>
-          <w:rFonts w:ascii="Times" w:hAnsi="Times" w:cs="Times"/>
-        </w:rPr>
-        <w:t xml:space="preserve">: A front-desk employee enters the customer's personal details into the </w:t>
-      </w:r>
-      <w:r>
-        <w:rPr>
-          <w:rFonts w:ascii="Courier" w:hAnsi="Courier" w:cs="Courier"/>
-          <w:sz w:val="26"/>
-        </w:rPr>
-        <w:t>CUSTOMER</w:t>
-      </w:r>
-      <w:r>
-        <w:rPr>
-          <w:rFonts w:ascii="Times" w:hAnsi="Times" w:cs="Times"/>
-        </w:rPr>
-        <w:t xml:space="preserve"> table. Following this, the vehicle details are registered into the </w:t>
-      </w:r>
-      <w:r>
-        <w:rPr>
-          <w:rFonts w:ascii="Courier" w:hAnsi="Courier" w:cs="Courier"/>
-          <w:sz w:val="26"/>
-        </w:rPr>
-        <w:t>VEHICLE</w:t>
-      </w:r>
-      <w:r>
-        <w:rPr>
-          <w:rFonts w:ascii="Times" w:hAnsi="Times" w:cs="Times"/>
-        </w:rPr>
-        <w:t xml:space="preserve"> table.</w:t>
-      </w:r>
-    </w:p>
-    <w:p>
-      <w:pPr>
-        <w:ind w:left="720"/>
-      </w:pPr>
-      <w:r>
-        <w:rPr>
-          <w:rFonts w:ascii="Times" w:hAnsi="Times" w:cs="Times"/>
-          <w:b/>
-        </w:rPr>
-        <w:tab/>
-        <w:t>•</w:t>
-      </w:r>
-      <w:r>
-        <w:rPr>
-          <w:rFonts w:ascii="Times" w:hAnsi="Times" w:cs="Times"/>
-          <w:b/>
-        </w:rPr>
-        <w:tab/>
-        <w:t>Inventory Restocking</w:t>
-      </w:r>
-      <w:r>
-        <w:rPr>
-          <w:rFonts w:ascii="Times" w:hAnsi="Times" w:cs="Times"/>
-        </w:rPr>
-        <w:t xml:space="preserve">: The workshop manager enters parts data into the </w:t>
+        <w:t>3. Data Output (Output)</w:t>
+      </w:r>
+    </w:p>
+    <w:p>
+      <w:pPr>
+        <w:ind w:left="720"/>
+      </w:pPr>
+      <w:r>
+        <w:rPr>
+          <w:rFonts w:ascii="Times" w:hAnsi="Times" w:cs="Times"/>
+          <w:b/>
+        </w:rPr>
+        <w:tab/>
+        <w:t>•</w:t>
+      </w:r>
+      <w:r>
+        <w:rPr>
+          <w:rFonts w:ascii="Times" w:hAnsi="Times" w:cs="Times"/>
+          <w:b/>
+        </w:rPr>
+        <w:tab/>
+        <w:t>Invoice Generation</w:t>
+      </w:r>
+      <w:r>
+        <w:rPr>
+          <w:rFonts w:ascii="Times" w:hAnsi="Times" w:cs="Times"/>
+        </w:rPr>
+        <w:t xml:space="preserve">: The system reads the </w:t>
+      </w:r>
+      <w:r>
+        <w:rPr>
+          <w:rFonts w:ascii="Courier" w:hAnsi="Courier" w:cs="Courier"/>
+          <w:sz w:val="26"/>
+        </w:rPr>
+        <w:t>LaborCost</w:t>
+      </w:r>
+      <w:r>
+        <w:rPr>
+          <w:rFonts w:ascii="Times" w:hAnsi="Times" w:cs="Times"/>
+        </w:rPr>
+        <w:t xml:space="preserve"> from </w:t>
+      </w:r>
+      <w:r>
+        <w:rPr>
+          <w:rFonts w:ascii="Courier" w:hAnsi="Courier" w:cs="Courier"/>
+          <w:sz w:val="26"/>
+        </w:rPr>
+        <w:t>SERVICE_JOB</w:t>
+      </w:r>
+      <w:r>
+        <w:rPr>
+          <w:rFonts w:ascii="Times" w:hAnsi="Times" w:cs="Times"/>
+        </w:rPr>
+        <w:t xml:space="preserve"> and joins </w:t>
+      </w:r>
+      <w:r>
+        <w:rPr>
+          <w:rFonts w:ascii="Courier" w:hAnsi="Courier" w:cs="Courier"/>
+          <w:sz w:val="26"/>
+        </w:rPr>
+        <w:t>SERVICE_PARTS</w:t>
+      </w:r>
+      <w:r>
+        <w:rPr>
+          <w:rFonts w:ascii="Times" w:hAnsi="Times" w:cs="Times"/>
+        </w:rPr>
+        <w:t xml:space="preserve"> with </w:t>
       </w:r>
       <w:r>
         <w:rPr>
@@ -2931,47 +3293,134 @@
         <w:rPr>
           <w:rFonts w:ascii="Times" w:hAnsi="Times" w:cs="Times"/>
         </w:rPr>
-        <w:t xml:space="preserve"> table.</w:t>
-      </w:r>
-    </w:p>
-    <w:p>
-      <w:pPr>
-        <w:ind w:left="720"/>
-      </w:pPr>
-      <w:r>
-        <w:rPr>
-          <w:rFonts w:ascii="Times" w:hAnsi="Times" w:cs="Times"/>
-          <w:b/>
-        </w:rPr>
-        <w:tab/>
-        <w:t>•</w:t>
-      </w:r>
-      <w:r>
-        <w:rPr>
-          <w:rFonts w:ascii="Times" w:hAnsi="Times" w:cs="Times"/>
-          <w:b/>
-        </w:rPr>
-        <w:tab/>
-        <w:t>Mechanic Onboarding</w:t>
-      </w:r>
-      <w:r>
-        <w:rPr>
-          <w:rFonts w:ascii="Times" w:hAnsi="Times" w:cs="Times"/>
-        </w:rPr>
-        <w:t xml:space="preserve">: Administration inputs employee data into the </w:t>
-      </w:r>
-      <w:r>
-        <w:rPr>
-          <w:rFonts w:ascii="Courier" w:hAnsi="Courier" w:cs="Courier"/>
-          <w:sz w:val="26"/>
-        </w:rPr>
-        <w:t>MECHANIC</w:t>
-      </w:r>
-      <w:r>
-        <w:rPr>
-          <w:rFonts w:ascii="Times" w:hAnsi="Times" w:cs="Times"/>
-        </w:rPr>
-        <w:t xml:space="preserve"> table.</w:t>
+        <w:t xml:space="preserve"> to calculate total costs, logging it in </w:t>
+      </w:r>
+      <w:r>
+        <w:rPr>
+          <w:rFonts w:ascii="Courier" w:hAnsi="Courier" w:cs="Courier"/>
+          <w:sz w:val="26"/>
+        </w:rPr>
+        <w:t>INVOICE</w:t>
+      </w:r>
+      <w:r>
+        <w:rPr>
+          <w:rFonts w:ascii="Times" w:hAnsi="Times" w:cs="Times"/>
+        </w:rPr>
+        <w:t>.</w:t>
+      </w:r>
+    </w:p>
+    <w:p>
+      <w:pPr>
+        <w:ind w:left="720"/>
+      </w:pPr>
+      <w:r>
+        <w:rPr>
+          <w:rFonts w:ascii="Times" w:hAnsi="Times" w:cs="Times"/>
+          <w:b/>
+        </w:rPr>
+        <w:tab/>
+        <w:t>•</w:t>
+      </w:r>
+      <w:r>
+        <w:rPr>
+          <w:rFonts w:ascii="Times" w:hAnsi="Times" w:cs="Times"/>
+          <w:b/>
+        </w:rPr>
+        <w:tab/>
+        <w:t>Business Reporting</w:t>
+      </w:r>
+      <w:r>
+        <w:rPr>
+          <w:rFonts w:ascii="Times" w:hAnsi="Times" w:cs="Times"/>
+        </w:rPr>
+        <w:t>: Management queries the system to extract analytical outputs.</w:t>
+      </w:r>
+    </w:p>
+    <w:p>
+      <w:pPr>
+        <w:spacing w:after="298"/>
+      </w:pPr>
+      <w:r>
+        <w:rPr>
+          <w:rFonts w:ascii="Times" w:hAnsi="Times" w:cs="Times"/>
+          <w:b/>
+          <w:sz w:val="36"/>
+        </w:rPr>
+        <w:t>Step 3: Export Clean CSV Files</w:t>
+      </w:r>
+    </w:p>
+    <w:p>
+      <w:pPr>
+        <w:spacing w:after="240"/>
+      </w:pPr>
+      <w:r>
+        <w:rPr>
+          <w:rFonts w:ascii="Times" w:hAnsi="Times" w:cs="Times"/>
+        </w:rPr>
+        <w:t xml:space="preserve">We exported the generated data into clean </w:t>
+      </w:r>
+      <w:r>
+        <w:rPr>
+          <w:rFonts w:ascii="Courier" w:hAnsi="Courier" w:cs="Courier"/>
+          <w:sz w:val="26"/>
+        </w:rPr>
+        <w:t>.csv</w:t>
+      </w:r>
+      <w:r>
+        <w:rPr>
+          <w:rFonts w:ascii="Times" w:hAnsi="Times" w:cs="Times"/>
+        </w:rPr>
+        <w:t xml:space="preserve"> format, with one file representing each table in the database schema. These files were staged in the </w:t>
+      </w:r>
+      <w:r>
+        <w:rPr>
+          <w:rFonts w:ascii="Courier" w:hAnsi="Courier" w:cs="Courier"/>
+          <w:sz w:val="26"/>
+        </w:rPr>
+        <w:t>Milestone3/DummyData/</w:t>
+      </w:r>
+      <w:r>
+        <w:rPr>
+          <w:rFonts w:ascii="Times" w:hAnsi="Times" w:cs="Times"/>
+        </w:rPr>
+        <w:t xml:space="preserve"> folder.</w:t>
+      </w:r>
+    </w:p>
+    <w:p>
+      <w:pPr>
+        <w:spacing w:after="321"/>
+      </w:pPr>
+      <w:r>
+        <w:rPr>
+          <w:rFonts w:ascii="Times" w:hAnsi="Times" w:cs="Times"/>
+          <w:b/>
+          <w:sz w:val="48"/>
+        </w:rPr>
+        <w:t>Milestone 4: Database Setup (DDL)</w:t>
+      </w:r>
+    </w:p>
+    <w:p>
+      <w:pPr>
+        <w:spacing w:after="298"/>
+      </w:pPr>
+      <w:r>
+        <w:rPr>
+          <w:rFonts w:ascii="Times" w:hAnsi="Times" w:cs="Times"/>
+          <w:b/>
+          <w:sz w:val="36"/>
+        </w:rPr>
+        <w:t>Step 1: DDL Script Creation</w:t>
+      </w:r>
+    </w:p>
+    <w:p>
+      <w:pPr>
+        <w:spacing w:after="240"/>
+      </w:pPr>
+      <w:r>
+        <w:rPr>
+          <w:rFonts w:ascii="Times" w:hAnsi="Times" w:cs="Times"/>
+        </w:rPr>
+        <w:t>A comprehensive Data Definition Language (DDL) script was created to generate the 7 core tables derived from our finalized normalized schema.</w:t>
       </w:r>
     </w:p>
     <w:p>
@@ -2984,34 +3433,728 @@
           <w:b/>
           <w:sz w:val="28"/>
         </w:rPr>
-        <w:t>2. Data Movement &amp; Processing (Throughput)</w:t>
-      </w:r>
-    </w:p>
-    <w:p>
-      <w:pPr>
-        <w:ind w:left="720"/>
-      </w:pPr>
-      <w:r>
-        <w:rPr>
-          <w:rFonts w:ascii="Times" w:hAnsi="Times" w:cs="Times"/>
-          <w:b/>
-        </w:rPr>
-        <w:tab/>
-        <w:t>•</w:t>
-      </w:r>
-      <w:r>
-        <w:rPr>
-          <w:rFonts w:ascii="Times" w:hAnsi="Times" w:cs="Times"/>
-          <w:b/>
-        </w:rPr>
-        <w:tab/>
-        <w:t>Service Job Creation</w:t>
-      </w:r>
-      <w:r>
-        <w:rPr>
-          <w:rFonts w:ascii="Times" w:hAnsi="Times" w:cs="Times"/>
-        </w:rPr>
-        <w:t xml:space="preserve">: A new record is created in the </w:t>
+        <w:t>Constraints Implemented:</w:t>
+      </w:r>
+    </w:p>
+    <w:p>
+      <w:pPr>
+        <w:ind w:left="720"/>
+      </w:pPr>
+      <w:r>
+        <w:rPr>
+          <w:rFonts w:ascii="Times" w:hAnsi="Times" w:cs="Times"/>
+          <w:b/>
+        </w:rPr>
+        <w:tab/>
+        <w:t>•</w:t>
+      </w:r>
+      <w:r>
+        <w:rPr>
+          <w:rFonts w:ascii="Times" w:hAnsi="Times" w:cs="Times"/>
+          <w:b/>
+        </w:rPr>
+        <w:tab/>
+        <w:t>Primary Keys (PRIMARY KEY)</w:t>
+      </w:r>
+      <w:r>
+        <w:rPr>
+          <w:rFonts w:ascii="Times" w:hAnsi="Times" w:cs="Times"/>
+        </w:rPr>
+        <w:t xml:space="preserve">: Applied to all tables. A composite primary key is correctly utilized in the </w:t>
+      </w:r>
+      <w:r>
+        <w:rPr>
+          <w:rFonts w:ascii="Courier" w:hAnsi="Courier" w:cs="Courier"/>
+          <w:sz w:val="26"/>
+        </w:rPr>
+        <w:t>SERVICE_PARTS</w:t>
+      </w:r>
+      <w:r>
+        <w:rPr>
+          <w:rFonts w:ascii="Times" w:hAnsi="Times" w:cs="Times"/>
+        </w:rPr>
+        <w:t xml:space="preserve"> junction table (</w:t>
+      </w:r>
+      <w:r>
+        <w:rPr>
+          <w:rFonts w:ascii="Courier" w:hAnsi="Courier" w:cs="Courier"/>
+          <w:sz w:val="26"/>
+        </w:rPr>
+        <w:t>JobID</w:t>
+      </w:r>
+      <w:r>
+        <w:rPr>
+          <w:rFonts w:ascii="Times" w:hAnsi="Times" w:cs="Times"/>
+        </w:rPr>
+        <w:t xml:space="preserve">, </w:t>
+      </w:r>
+      <w:r>
+        <w:rPr>
+          <w:rFonts w:ascii="Courier" w:hAnsi="Courier" w:cs="Courier"/>
+          <w:sz w:val="26"/>
+        </w:rPr>
+        <w:t>PartID</w:t>
+      </w:r>
+      <w:r>
+        <w:rPr>
+          <w:rFonts w:ascii="Times" w:hAnsi="Times" w:cs="Times"/>
+        </w:rPr>
+        <w:t>).</w:t>
+      </w:r>
+    </w:p>
+    <w:p>
+      <w:pPr>
+        <w:ind w:left="720"/>
+      </w:pPr>
+      <w:r>
+        <w:rPr>
+          <w:rFonts w:ascii="Times" w:hAnsi="Times" w:cs="Times"/>
+          <w:b/>
+        </w:rPr>
+        <w:tab/>
+        <w:t>•</w:t>
+      </w:r>
+      <w:r>
+        <w:rPr>
+          <w:rFonts w:ascii="Times" w:hAnsi="Times" w:cs="Times"/>
+          <w:b/>
+        </w:rPr>
+        <w:tab/>
+        <w:t>Foreign Keys (FOREIGN KEY)</w:t>
+      </w:r>
+      <w:r>
+        <w:rPr>
+          <w:rFonts w:ascii="Times" w:hAnsi="Times" w:cs="Times"/>
+        </w:rPr>
+        <w:t xml:space="preserve">: Defined explicit relational mapping between tables ensuring referential integrity. </w:t>
+      </w:r>
+      <w:r>
+        <w:rPr>
+          <w:rFonts w:ascii="Courier" w:hAnsi="Courier" w:cs="Courier"/>
+          <w:sz w:val="26"/>
+        </w:rPr>
+        <w:t>ON DELETE CASCADE</w:t>
+      </w:r>
+      <w:r>
+        <w:rPr>
+          <w:rFonts w:ascii="Times" w:hAnsi="Times" w:cs="Times"/>
+        </w:rPr>
+        <w:t xml:space="preserve"> is utilized for parent-child relations like Customer-to-Vehicle. </w:t>
+      </w:r>
+      <w:r>
+        <w:rPr>
+          <w:rFonts w:ascii="Courier" w:hAnsi="Courier" w:cs="Courier"/>
+          <w:sz w:val="26"/>
+        </w:rPr>
+        <w:t>ON DELETE RESTRICT</w:t>
+      </w:r>
+      <w:r>
+        <w:rPr>
+          <w:rFonts w:ascii="Times" w:hAnsi="Times" w:cs="Times"/>
+        </w:rPr>
+        <w:t xml:space="preserve"> is used to prevent the accidental deletion of active Mechanics or Spare Parts.</w:t>
+      </w:r>
+    </w:p>
+    <w:p>
+      <w:pPr>
+        <w:ind w:left="720"/>
+      </w:pPr>
+      <w:r>
+        <w:rPr>
+          <w:rFonts w:ascii="Times" w:hAnsi="Times" w:cs="Times"/>
+          <w:b/>
+        </w:rPr>
+        <w:tab/>
+        <w:t>•</w:t>
+      </w:r>
+      <w:r>
+        <w:rPr>
+          <w:rFonts w:ascii="Times" w:hAnsi="Times" w:cs="Times"/>
+          <w:b/>
+        </w:rPr>
+        <w:tab/>
+        <w:t>Data Integrity (NOT NULL)</w:t>
+      </w:r>
+      <w:r>
+        <w:rPr>
+          <w:rFonts w:ascii="Times" w:hAnsi="Times" w:cs="Times"/>
+        </w:rPr>
+        <w:t xml:space="preserve">: Applied to core data points such as </w:t>
+      </w:r>
+      <w:r>
+        <w:rPr>
+          <w:rFonts w:ascii="Courier" w:hAnsi="Courier" w:cs="Courier"/>
+          <w:sz w:val="26"/>
+        </w:rPr>
+        <w:t>FirstName</w:t>
+      </w:r>
+      <w:r>
+        <w:rPr>
+          <w:rFonts w:ascii="Times" w:hAnsi="Times" w:cs="Times"/>
+        </w:rPr>
+        <w:t xml:space="preserve">, </w:t>
+      </w:r>
+      <w:r>
+        <w:rPr>
+          <w:rFonts w:ascii="Courier" w:hAnsi="Courier" w:cs="Courier"/>
+          <w:sz w:val="26"/>
+        </w:rPr>
+        <w:t>Date</w:t>
+      </w:r>
+      <w:r>
+        <w:rPr>
+          <w:rFonts w:ascii="Times" w:hAnsi="Times" w:cs="Times"/>
+        </w:rPr>
+        <w:t xml:space="preserve">, and </w:t>
+      </w:r>
+      <w:r>
+        <w:rPr>
+          <w:rFonts w:ascii="Courier" w:hAnsi="Courier" w:cs="Courier"/>
+          <w:sz w:val="26"/>
+        </w:rPr>
+        <w:t>Status</w:t>
+      </w:r>
+      <w:r>
+        <w:rPr>
+          <w:rFonts w:ascii="Times" w:hAnsi="Times" w:cs="Times"/>
+        </w:rPr>
+        <w:t>.</w:t>
+      </w:r>
+    </w:p>
+    <w:p>
+      <w:pPr>
+        <w:ind w:left="720"/>
+      </w:pPr>
+      <w:r>
+        <w:rPr>
+          <w:rFonts w:ascii="Times" w:hAnsi="Times" w:cs="Times"/>
+          <w:b/>
+        </w:rPr>
+        <w:tab/>
+        <w:t>•</w:t>
+      </w:r>
+      <w:r>
+        <w:rPr>
+          <w:rFonts w:ascii="Times" w:hAnsi="Times" w:cs="Times"/>
+          <w:b/>
+        </w:rPr>
+        <w:tab/>
+        <w:t>Unique Constraints (UNIQUE)</w:t>
+      </w:r>
+      <w:r>
+        <w:rPr>
+          <w:rFonts w:ascii="Times" w:hAnsi="Times" w:cs="Times"/>
+        </w:rPr>
+        <w:t xml:space="preserve">: Applied to </w:t>
+      </w:r>
+      <w:r>
+        <w:rPr>
+          <w:rFonts w:ascii="Courier" w:hAnsi="Courier" w:cs="Courier"/>
+          <w:sz w:val="26"/>
+        </w:rPr>
+        <w:t>Email</w:t>
+      </w:r>
+      <w:r>
+        <w:rPr>
+          <w:rFonts w:ascii="Times" w:hAnsi="Times" w:cs="Times"/>
+        </w:rPr>
+        <w:t xml:space="preserve"> (Customer) and </w:t>
+      </w:r>
+      <w:r>
+        <w:rPr>
+          <w:rFonts w:ascii="Courier" w:hAnsi="Courier" w:cs="Courier"/>
+          <w:sz w:val="26"/>
+        </w:rPr>
+        <w:t>RegNo</w:t>
+      </w:r>
+      <w:r>
+        <w:rPr>
+          <w:rFonts w:ascii="Times" w:hAnsi="Times" w:cs="Times"/>
+        </w:rPr>
+        <w:t xml:space="preserve"> (Vehicle) to ensure no duplicate entries exist in the system.</w:t>
+      </w:r>
+    </w:p>
+    <w:p>
+      <w:pPr>
+        <w:ind w:left="720"/>
+      </w:pPr>
+      <w:r>
+        <w:rPr>
+          <w:rFonts w:ascii="Times" w:hAnsi="Times" w:cs="Times"/>
+          <w:b/>
+        </w:rPr>
+        <w:tab/>
+        <w:t>•</w:t>
+      </w:r>
+      <w:r>
+        <w:rPr>
+          <w:rFonts w:ascii="Times" w:hAnsi="Times" w:cs="Times"/>
+          <w:b/>
+        </w:rPr>
+        <w:tab/>
+        <w:t>Check Constraints (CHECK)</w:t>
+      </w:r>
+      <w:r>
+        <w:rPr>
+          <w:rFonts w:ascii="Times" w:hAnsi="Times" w:cs="Times"/>
+        </w:rPr>
+        <w:t>: Added robust domain validations.</w:t>
+      </w:r>
+    </w:p>
+    <w:p>
+      <w:pPr>
+        <w:ind w:left="1440"/>
+      </w:pPr>
+      <w:r>
+        <w:rPr>
+          <w:rFonts w:ascii="Courier" w:hAnsi="Courier" w:cs="Courier"/>
+          <w:sz w:val="26"/>
+        </w:rPr>
+        <w:tab/>
+        <w:t>◦</w:t>
+      </w:r>
+      <w:r>
+        <w:rPr>
+          <w:rFonts w:ascii="Courier" w:hAnsi="Courier" w:cs="Courier"/>
+          <w:sz w:val="26"/>
+        </w:rPr>
+        <w:tab/>
+        <w:t>SkillLevel</w:t>
+      </w:r>
+      <w:r>
+        <w:rPr>
+          <w:rFonts w:ascii="Times" w:hAnsi="Times" w:cs="Times"/>
+        </w:rPr>
+        <w:t xml:space="preserve"> in Mechanics must be 'Junior', 'Intermediate', 'Senior', or 'Master'.</w:t>
+      </w:r>
+    </w:p>
+    <w:p>
+      <w:pPr>
+        <w:ind w:left="1440"/>
+      </w:pPr>
+      <w:r>
+        <w:rPr>
+          <w:rFonts w:ascii="Courier" w:hAnsi="Courier" w:cs="Courier"/>
+          <w:sz w:val="26"/>
+        </w:rPr>
+        <w:lastRenderedPageBreak/>
+        <w:tab/>
+        <w:t>◦</w:t>
+      </w:r>
+      <w:r>
+        <w:rPr>
+          <w:rFonts w:ascii="Courier" w:hAnsi="Courier" w:cs="Courier"/>
+          <w:sz w:val="26"/>
+        </w:rPr>
+        <w:tab/>
+        <w:t>Status</w:t>
+      </w:r>
+      <w:r>
+        <w:rPr>
+          <w:rFonts w:ascii="Times" w:hAnsi="Times" w:cs="Times"/>
+        </w:rPr>
+        <w:t xml:space="preserve"> in Service_Job must be 'Pending', 'In Progress', 'Completed', or 'Cancelled'.</w:t>
+      </w:r>
+    </w:p>
+    <w:p>
+      <w:pPr>
+        <w:ind w:left="1440"/>
+      </w:pPr>
+      <w:r>
+        <w:rPr>
+          <w:rFonts w:ascii="Times" w:hAnsi="Times" w:cs="Times"/>
+        </w:rPr>
+        <w:tab/>
+        <w:t>◦</w:t>
+      </w:r>
+      <w:r>
+        <w:rPr>
+          <w:rFonts w:ascii="Times" w:hAnsi="Times" w:cs="Times"/>
+        </w:rPr>
+        <w:tab/>
+        <w:t>Monetary values (</w:t>
+      </w:r>
+      <w:r>
+        <w:rPr>
+          <w:rFonts w:ascii="Courier" w:hAnsi="Courier" w:cs="Courier"/>
+          <w:sz w:val="26"/>
+        </w:rPr>
+        <w:t>LaborCost</w:t>
+      </w:r>
+      <w:r>
+        <w:rPr>
+          <w:rFonts w:ascii="Times" w:hAnsi="Times" w:cs="Times"/>
+        </w:rPr>
+        <w:t xml:space="preserve">, </w:t>
+      </w:r>
+      <w:r>
+        <w:rPr>
+          <w:rFonts w:ascii="Courier" w:hAnsi="Courier" w:cs="Courier"/>
+          <w:sz w:val="26"/>
+        </w:rPr>
+        <w:t>UnitPrice</w:t>
+      </w:r>
+      <w:r>
+        <w:rPr>
+          <w:rFonts w:ascii="Times" w:hAnsi="Times" w:cs="Times"/>
+        </w:rPr>
+        <w:t xml:space="preserve">) and </w:t>
+      </w:r>
+      <w:r>
+        <w:rPr>
+          <w:rFonts w:ascii="Courier" w:hAnsi="Courier" w:cs="Courier"/>
+          <w:sz w:val="26"/>
+        </w:rPr>
+        <w:t>Quantity</w:t>
+      </w:r>
+      <w:r>
+        <w:rPr>
+          <w:rFonts w:ascii="Times" w:hAnsi="Times" w:cs="Times"/>
+        </w:rPr>
+        <w:t xml:space="preserve"> strictly enforce zero or positive constraints.</w:t>
+      </w:r>
+    </w:p>
+    <w:p>
+      <w:pPr>
+        <w:spacing w:after="280"/>
+      </w:pPr>
+      <w:r>
+        <w:rPr>
+          <w:rFonts w:ascii="Times" w:hAnsi="Times" w:cs="Times"/>
+          <w:b/>
+          <w:sz w:val="28"/>
+        </w:rPr>
+        <w:t>Indexing Implemented:</w:t>
+      </w:r>
+    </w:p>
+    <w:p>
+      <w:pPr>
+        <w:ind w:left="720"/>
+      </w:pPr>
+      <w:r>
+        <w:rPr>
+          <w:rFonts w:ascii="Times" w:hAnsi="Times" w:cs="Times"/>
+        </w:rPr>
+        <w:tab/>
+        <w:t>•</w:t>
+      </w:r>
+      <w:r>
+        <w:rPr>
+          <w:rFonts w:ascii="Times" w:hAnsi="Times" w:cs="Times"/>
+        </w:rPr>
+        <w:tab/>
+        <w:t>Indexes (</w:t>
+      </w:r>
+      <w:r>
+        <w:rPr>
+          <w:rFonts w:ascii="Courier" w:hAnsi="Courier" w:cs="Courier"/>
+          <w:sz w:val="26"/>
+        </w:rPr>
+        <w:t>CREATE INDEX</w:t>
+      </w:r>
+      <w:r>
+        <w:rPr>
+          <w:rFonts w:ascii="Times" w:hAnsi="Times" w:cs="Times"/>
+        </w:rPr>
+        <w:t>) have been explicitly declared for:</w:t>
+      </w:r>
+    </w:p>
+    <w:p>
+      <w:pPr>
+        <w:ind w:left="1440"/>
+      </w:pPr>
+      <w:r>
+        <w:rPr>
+          <w:rFonts w:ascii="Times" w:hAnsi="Times" w:cs="Times"/>
+        </w:rPr>
+        <w:tab/>
+        <w:t>◦</w:t>
+      </w:r>
+      <w:r>
+        <w:rPr>
+          <w:rFonts w:ascii="Times" w:hAnsi="Times" w:cs="Times"/>
+        </w:rPr>
+        <w:tab/>
+        <w:t>All Foreign Key columns to dramatically speed up join operations and cascaded deletes.</w:t>
+      </w:r>
+    </w:p>
+    <w:p>
+      <w:pPr>
+        <w:ind w:left="1440"/>
+      </w:pPr>
+      <w:r>
+        <w:rPr>
+          <w:rFonts w:ascii="Times" w:hAnsi="Times" w:cs="Times"/>
+        </w:rPr>
+        <w:tab/>
+        <w:t>◦</w:t>
+      </w:r>
+      <w:r>
+        <w:rPr>
+          <w:rFonts w:ascii="Times" w:hAnsi="Times" w:cs="Times"/>
+        </w:rPr>
+        <w:tab/>
+        <w:t xml:space="preserve">Frequently queried status fields (e.g., </w:t>
+      </w:r>
+      <w:r>
+        <w:rPr>
+          <w:rFonts w:ascii="Courier" w:hAnsi="Courier" w:cs="Courier"/>
+          <w:sz w:val="26"/>
+        </w:rPr>
+        <w:t>PaymentStatus</w:t>
+      </w:r>
+      <w:r>
+        <w:rPr>
+          <w:rFonts w:ascii="Times" w:hAnsi="Times" w:cs="Times"/>
+        </w:rPr>
+        <w:t xml:space="preserve">, </w:t>
+      </w:r>
+      <w:r>
+        <w:rPr>
+          <w:rFonts w:ascii="Courier" w:hAnsi="Courier" w:cs="Courier"/>
+          <w:sz w:val="26"/>
+        </w:rPr>
+        <w:t>Status</w:t>
+      </w:r>
+      <w:r>
+        <w:rPr>
+          <w:rFonts w:ascii="Times" w:hAnsi="Times" w:cs="Times"/>
+        </w:rPr>
+        <w:t>).</w:t>
+      </w:r>
+    </w:p>
+    <w:p>
+      <w:pPr>
+        <w:ind w:left="1440"/>
+      </w:pPr>
+      <w:r>
+        <w:rPr>
+          <w:rFonts w:ascii="Times" w:hAnsi="Times" w:cs="Times"/>
+        </w:rPr>
+        <w:tab/>
+        <w:t>◦</w:t>
+      </w:r>
+      <w:r>
+        <w:rPr>
+          <w:rFonts w:ascii="Times" w:hAnsi="Times" w:cs="Times"/>
+        </w:rPr>
+        <w:tab/>
+        <w:t xml:space="preserve">Common lookup fields like </w:t>
+      </w:r>
+      <w:r>
+        <w:rPr>
+          <w:rFonts w:ascii="Courier" w:hAnsi="Courier" w:cs="Courier"/>
+          <w:sz w:val="26"/>
+        </w:rPr>
+        <w:t>Email</w:t>
+      </w:r>
+      <w:r>
+        <w:rPr>
+          <w:rFonts w:ascii="Times" w:hAnsi="Times" w:cs="Times"/>
+        </w:rPr>
+        <w:t xml:space="preserve">, </w:t>
+      </w:r>
+      <w:r>
+        <w:rPr>
+          <w:rFonts w:ascii="Courier" w:hAnsi="Courier" w:cs="Courier"/>
+          <w:sz w:val="26"/>
+        </w:rPr>
+        <w:t>RegNo</w:t>
+      </w:r>
+      <w:r>
+        <w:rPr>
+          <w:rFonts w:ascii="Times" w:hAnsi="Times" w:cs="Times"/>
+        </w:rPr>
+        <w:t xml:space="preserve">, and </w:t>
+      </w:r>
+      <w:r>
+        <w:rPr>
+          <w:rFonts w:ascii="Courier" w:hAnsi="Courier" w:cs="Courier"/>
+          <w:sz w:val="26"/>
+        </w:rPr>
+        <w:t>LastName</w:t>
+      </w:r>
+      <w:r>
+        <w:rPr>
+          <w:rFonts w:ascii="Times" w:hAnsi="Times" w:cs="Times"/>
+        </w:rPr>
+        <w:t>.</w:t>
+      </w:r>
+    </w:p>
+    <w:p>
+      <w:pPr>
+        <w:spacing w:after="298"/>
+      </w:pPr>
+      <w:r>
+        <w:rPr>
+          <w:rFonts w:ascii="Times" w:hAnsi="Times" w:cs="Times"/>
+          <w:b/>
+          <w:sz w:val="36"/>
+        </w:rPr>
+        <w:t>Step 2: Verification Process</w:t>
+      </w:r>
+    </w:p>
+    <w:p>
+      <w:pPr>
+        <w:spacing w:after="240"/>
+      </w:pPr>
+      <w:r>
+        <w:rPr>
+          <w:rFonts w:ascii="Times" w:hAnsi="Times" w:cs="Times"/>
+        </w:rPr>
+        <w:t>The script was structured specifically for full compatibility with MySQL Workbench, ready to be reverse-engineered into an EER Diagram.</w:t>
+      </w:r>
+    </w:p>
+    <w:p>
+      <w:pPr>
+        <w:spacing w:after="321"/>
+      </w:pPr>
+      <w:r>
+        <w:rPr>
+          <w:rFonts w:ascii="Times" w:hAnsi="Times" w:cs="Times"/>
+          <w:b/>
+          <w:sz w:val="48"/>
+        </w:rPr>
+        <w:t>Milestone 5: Data Population &amp; Validation</w:t>
+      </w:r>
+    </w:p>
+    <w:p>
+      <w:pPr>
+        <w:spacing w:after="298"/>
+      </w:pPr>
+      <w:r>
+        <w:rPr>
+          <w:rFonts w:ascii="Times" w:hAnsi="Times" w:cs="Times"/>
+          <w:b/>
+          <w:sz w:val="36"/>
+        </w:rPr>
+        <w:t>Step 1: Data Loading (DML)</w:t>
+      </w:r>
+    </w:p>
+    <w:p>
+      <w:pPr>
+        <w:spacing w:after="240"/>
+      </w:pPr>
+      <w:r>
+        <w:rPr>
+          <w:rFonts w:ascii="Times" w:hAnsi="Times" w:cs="Times"/>
+        </w:rPr>
+        <w:t>A comprehensive Data Manipulation Language (DML) script was created.</w:t>
+      </w:r>
+    </w:p>
+    <w:p>
+      <w:pPr>
+        <w:ind w:left="720"/>
+      </w:pPr>
+      <w:r>
+        <w:rPr>
+          <w:rFonts w:ascii="Times" w:hAnsi="Times" w:cs="Times"/>
+        </w:rPr>
+        <w:tab/>
+        <w:t>•</w:t>
+      </w:r>
+      <w:r>
+        <w:rPr>
+          <w:rFonts w:ascii="Times" w:hAnsi="Times" w:cs="Times"/>
+        </w:rPr>
+        <w:tab/>
+        <w:t xml:space="preserve">We utilized standard </w:t>
+      </w:r>
+      <w:r>
+        <w:rPr>
+          <w:rFonts w:ascii="Courier" w:hAnsi="Courier" w:cs="Courier"/>
+          <w:sz w:val="26"/>
+        </w:rPr>
+        <w:t>INSERT INTO ... VALUES ...</w:t>
+      </w:r>
+      <w:r>
+        <w:rPr>
+          <w:rFonts w:ascii="Times" w:hAnsi="Times" w:cs="Times"/>
+        </w:rPr>
+        <w:t xml:space="preserve"> statements to bulk-insert the synthetic data generated in Milestone 3 directly into the respective MySQL tables.</w:t>
+      </w:r>
+    </w:p>
+    <w:p>
+      <w:pPr>
+        <w:ind w:left="720"/>
+      </w:pPr>
+      <w:r>
+        <w:rPr>
+          <w:rFonts w:ascii="Times" w:hAnsi="Times" w:cs="Times"/>
+        </w:rPr>
+        <w:tab/>
+        <w:t>•</w:t>
+      </w:r>
+      <w:r>
+        <w:rPr>
+          <w:rFonts w:ascii="Times" w:hAnsi="Times" w:cs="Times"/>
+        </w:rPr>
+        <w:tab/>
+        <w:t>This approach populates all 7 core tables with exactly 50 rows of realistic dummy data, avoiding common MySQL local file permission issues.</w:t>
+      </w:r>
+    </w:p>
+    <w:p>
+      <w:pPr>
+        <w:spacing w:after="298"/>
+      </w:pPr>
+      <w:r>
+        <w:rPr>
+          <w:rFonts w:ascii="Times" w:hAnsi="Times" w:cs="Times"/>
+          <w:b/>
+          <w:sz w:val="36"/>
+        </w:rPr>
+        <w:t>Step 2: DML Operations</w:t>
+      </w:r>
+    </w:p>
+    <w:p>
+      <w:pPr>
+        <w:spacing w:after="240"/>
+      </w:pPr>
+      <w:r>
+        <w:rPr>
+          <w:rFonts w:ascii="Times" w:hAnsi="Times" w:cs="Times"/>
+        </w:rPr>
+        <w:t>To demonstrate active database management, two explicit data manipulation operations were executed:</w:t>
+      </w:r>
+    </w:p>
+    <w:p>
+      <w:pPr>
+        <w:ind w:left="720"/>
+      </w:pPr>
+      <w:r>
+        <w:rPr>
+          <w:rFonts w:ascii="Times" w:hAnsi="Times" w:cs="Times"/>
+          <w:b/>
+        </w:rPr>
+        <w:tab/>
+        <w:t>•</w:t>
+      </w:r>
+      <w:r>
+        <w:rPr>
+          <w:rFonts w:ascii="Times" w:hAnsi="Times" w:cs="Times"/>
+          <w:b/>
+        </w:rPr>
+        <w:tab/>
+        <w:t>UPDATE Operation</w:t>
+      </w:r>
+      <w:r>
+        <w:rPr>
+          <w:rFonts w:ascii="Times" w:hAnsi="Times" w:cs="Times"/>
+        </w:rPr>
+        <w:t xml:space="preserve">: We included a </w:t>
+      </w:r>
+      <w:r>
+        <w:rPr>
+          <w:rFonts w:ascii="Courier" w:hAnsi="Courier" w:cs="Courier"/>
+          <w:sz w:val="26"/>
+        </w:rPr>
+        <w:t>WHERE</w:t>
+      </w:r>
+      <w:r>
+        <w:rPr>
+          <w:rFonts w:ascii="Times" w:hAnsi="Times" w:cs="Times"/>
+        </w:rPr>
+        <w:t xml:space="preserve"> clause condition to isolate specific rows. Specifically, we updated the </w:t>
       </w:r>
       <w:r>
         <w:rPr>
@@ -3024,1067 +4167,14 @@
         <w:rPr>
           <w:rFonts w:ascii="Times" w:hAnsi="Times" w:cs="Times"/>
         </w:rPr>
-        <w:t xml:space="preserve"> table when a vehicle is assigned to a mechanic.</w:t>
-      </w:r>
-    </w:p>
-    <w:p>
-      <w:pPr>
-        <w:ind w:left="720"/>
-      </w:pPr>
-      <w:r>
-        <w:rPr>
-          <w:rFonts w:ascii="Times" w:hAnsi="Times" w:cs="Times"/>
-          <w:b/>
-        </w:rPr>
-        <w:tab/>
-        <w:t>•</w:t>
-      </w:r>
-      <w:r>
-        <w:rPr>
-          <w:rFonts w:ascii="Times" w:hAnsi="Times" w:cs="Times"/>
-          <w:b/>
-        </w:rPr>
-        <w:tab/>
-        <w:t>Parts Consumption</w:t>
-      </w:r>
-      <w:r>
-        <w:rPr>
-          <w:rFonts w:ascii="Times" w:hAnsi="Times" w:cs="Times"/>
-        </w:rPr>
-        <w:t xml:space="preserve">: As the mechanic works, entries are logged in the </w:t>
-      </w:r>
-      <w:r>
-        <w:rPr>
-          <w:rFonts w:ascii="Courier" w:hAnsi="Courier" w:cs="Courier"/>
-          <w:sz w:val="26"/>
-        </w:rPr>
-        <w:t>SERVICE_PARTS</w:t>
-      </w:r>
-      <w:r>
-        <w:rPr>
-          <w:rFonts w:ascii="Times" w:hAnsi="Times" w:cs="Times"/>
-        </w:rPr>
-        <w:t xml:space="preserve"> junction table.</w:t>
-      </w:r>
-    </w:p>
-    <w:p>
-      <w:pPr>
-        <w:ind w:left="720"/>
-      </w:pPr>
-      <w:r>
-        <w:rPr>
-          <w:rFonts w:ascii="Times" w:hAnsi="Times" w:cs="Times"/>
-          <w:b/>
-        </w:rPr>
-        <w:tab/>
-        <w:t>•</w:t>
-      </w:r>
-      <w:r>
-        <w:rPr>
-          <w:rFonts w:ascii="Times" w:hAnsi="Times" w:cs="Times"/>
-          <w:b/>
-        </w:rPr>
-        <w:tab/>
-        <w:t>Labor Logging</w:t>
-      </w:r>
-      <w:r>
-        <w:rPr>
-          <w:rFonts w:ascii="Times" w:hAnsi="Times" w:cs="Times"/>
-        </w:rPr>
-        <w:t xml:space="preserve">: Upon job completion, the </w:t>
-      </w:r>
-      <w:r>
-        <w:rPr>
-          <w:rFonts w:ascii="Courier" w:hAnsi="Courier" w:cs="Courier"/>
-          <w:sz w:val="26"/>
-        </w:rPr>
-        <w:t>Status</w:t>
-      </w:r>
-      <w:r>
-        <w:rPr>
-          <w:rFonts w:ascii="Times" w:hAnsi="Times" w:cs="Times"/>
-        </w:rPr>
-        <w:t xml:space="preserve"> is changed to "Completed" and final </w:t>
-      </w:r>
-      <w:r>
-        <w:rPr>
-          <w:rFonts w:ascii="Courier" w:hAnsi="Courier" w:cs="Courier"/>
-          <w:sz w:val="26"/>
-        </w:rPr>
-        <w:t>LaborCost</w:t>
-      </w:r>
-      <w:r>
-        <w:rPr>
-          <w:rFonts w:ascii="Times" w:hAnsi="Times" w:cs="Times"/>
-        </w:rPr>
-        <w:t xml:space="preserve"> is logged.</w:t>
-      </w:r>
-    </w:p>
-    <w:p>
-      <w:pPr>
-        <w:spacing w:after="280"/>
-      </w:pPr>
-      <w:r>
-        <w:rPr>
-          <w:rFonts w:ascii="Times" w:hAnsi="Times" w:cs="Times"/>
-          <w:b/>
-          <w:sz w:val="28"/>
-        </w:rPr>
-        <w:t>3. Data Output (Output)</w:t>
-      </w:r>
-    </w:p>
-    <w:p>
-      <w:pPr>
-        <w:ind w:left="720"/>
-      </w:pPr>
-      <w:r>
-        <w:rPr>
-          <w:rFonts w:ascii="Times" w:hAnsi="Times" w:cs="Times"/>
-          <w:b/>
-        </w:rPr>
-        <w:tab/>
-        <w:t>•</w:t>
-      </w:r>
-      <w:r>
-        <w:rPr>
-          <w:rFonts w:ascii="Times" w:hAnsi="Times" w:cs="Times"/>
-          <w:b/>
-        </w:rPr>
-        <w:tab/>
-        <w:t>Invoice Generation</w:t>
-      </w:r>
-      <w:r>
-        <w:rPr>
-          <w:rFonts w:ascii="Times" w:hAnsi="Times" w:cs="Times"/>
-        </w:rPr>
-        <w:t xml:space="preserve">: The system reads the </w:t>
-      </w:r>
-      <w:r>
-        <w:rPr>
-          <w:rFonts w:ascii="Courier" w:hAnsi="Courier" w:cs="Courier"/>
-          <w:sz w:val="26"/>
-        </w:rPr>
-        <w:t>LaborCost</w:t>
-      </w:r>
-      <w:r>
-        <w:rPr>
-          <w:rFonts w:ascii="Times" w:hAnsi="Times" w:cs="Times"/>
-        </w:rPr>
-        <w:t xml:space="preserve"> from </w:t>
-      </w:r>
-      <w:r>
-        <w:rPr>
-          <w:rFonts w:ascii="Courier" w:hAnsi="Courier" w:cs="Courier"/>
-          <w:sz w:val="26"/>
-        </w:rPr>
-        <w:t>SERVICE_JOB</w:t>
-      </w:r>
-      <w:r>
-        <w:rPr>
-          <w:rFonts w:ascii="Times" w:hAnsi="Times" w:cs="Times"/>
-        </w:rPr>
-        <w:t xml:space="preserve"> and joins </w:t>
-      </w:r>
-      <w:r>
-        <w:rPr>
-          <w:rFonts w:ascii="Courier" w:hAnsi="Courier" w:cs="Courier"/>
-          <w:sz w:val="26"/>
-        </w:rPr>
-        <w:t>SERVICE_PARTS</w:t>
-      </w:r>
-      <w:r>
-        <w:rPr>
-          <w:rFonts w:ascii="Times" w:hAnsi="Times" w:cs="Times"/>
-        </w:rPr>
-        <w:t xml:space="preserve"> with </w:t>
-      </w:r>
-      <w:r>
-        <w:rPr>
-          <w:rFonts w:ascii="Courier" w:hAnsi="Courier" w:cs="Courier"/>
-          <w:sz w:val="26"/>
-        </w:rPr>
-        <w:t>SPARE_PART</w:t>
-      </w:r>
-      <w:r>
-        <w:rPr>
-          <w:rFonts w:ascii="Times" w:hAnsi="Times" w:cs="Times"/>
-        </w:rPr>
-        <w:t xml:space="preserve"> to calculate total costs, logging it in </w:t>
-      </w:r>
-      <w:r>
-        <w:rPr>
-          <w:rFonts w:ascii="Courier" w:hAnsi="Courier" w:cs="Courier"/>
-          <w:sz w:val="26"/>
-        </w:rPr>
-        <w:t>INVOICE</w:t>
-      </w:r>
-      <w:r>
-        <w:rPr>
-          <w:rFonts w:ascii="Times" w:hAnsi="Times" w:cs="Times"/>
-        </w:rPr>
-        <w:t>.</w:t>
-      </w:r>
-    </w:p>
-    <w:p>
-      <w:pPr>
-        <w:ind w:left="720"/>
-      </w:pPr>
-      <w:r>
-        <w:rPr>
-          <w:rFonts w:ascii="Times" w:hAnsi="Times" w:cs="Times"/>
-          <w:b/>
-        </w:rPr>
-        <w:tab/>
-        <w:t>•</w:t>
-      </w:r>
-      <w:r>
-        <w:rPr>
-          <w:rFonts w:ascii="Times" w:hAnsi="Times" w:cs="Times"/>
-          <w:b/>
-        </w:rPr>
-        <w:tab/>
-        <w:t>Business Reporting</w:t>
-      </w:r>
-      <w:r>
-        <w:rPr>
-          <w:rFonts w:ascii="Times" w:hAnsi="Times" w:cs="Times"/>
-        </w:rPr>
-        <w:t>: Management queries the system to extract analytical outputs.</w:t>
-      </w:r>
-    </w:p>
-    <w:p>
-      <w:pPr>
-        <w:spacing w:after="298"/>
-      </w:pPr>
-      <w:r>
-        <w:rPr>
-          <w:rFonts w:ascii="Times" w:hAnsi="Times" w:cs="Times"/>
-          <w:b/>
-          <w:sz w:val="36"/>
-        </w:rPr>
-        <w:t>Step 3: Export Clean CSV Files</w:t>
-      </w:r>
-    </w:p>
-    <w:p>
-      <w:pPr>
-        <w:spacing w:after="240"/>
-      </w:pPr>
-      <w:r>
-        <w:rPr>
-          <w:rFonts w:ascii="Times" w:hAnsi="Times" w:cs="Times"/>
-        </w:rPr>
-        <w:t xml:space="preserve">We exported the generated data into clean </w:t>
-      </w:r>
-      <w:r>
-        <w:rPr>
-          <w:rFonts w:ascii="Courier" w:hAnsi="Courier" w:cs="Courier"/>
-          <w:sz w:val="26"/>
-        </w:rPr>
-        <w:t>.csv</w:t>
-      </w:r>
-      <w:r>
-        <w:rPr>
-          <w:rFonts w:ascii="Times" w:hAnsi="Times" w:cs="Times"/>
-        </w:rPr>
-        <w:t xml:space="preserve"> format, with one file representing each table in the database schema. These files were staged in the </w:t>
-      </w:r>
-      <w:r>
-        <w:rPr>
-          <w:rFonts w:ascii="Courier" w:hAnsi="Courier" w:cs="Courier"/>
-          <w:sz w:val="26"/>
-        </w:rPr>
-        <w:t>Milestone3/DummyData/</w:t>
-      </w:r>
-      <w:r>
-        <w:rPr>
-          <w:rFonts w:ascii="Times" w:hAnsi="Times" w:cs="Times"/>
-        </w:rPr>
-        <w:t xml:space="preserve"> folder.</w:t>
-      </w:r>
-    </w:p>
-    <w:p>
-      <w:pPr>
-        <w:spacing w:after="321"/>
-      </w:pPr>
-      <w:r>
-        <w:rPr>
-          <w:rFonts w:ascii="Times" w:hAnsi="Times" w:cs="Times"/>
-          <w:b/>
-          <w:sz w:val="48"/>
-        </w:rPr>
-        <w:t>Milestone 4: Database Setup (DDL)</w:t>
-      </w:r>
-    </w:p>
-    <w:p>
-      <w:pPr>
-        <w:spacing w:after="298"/>
-      </w:pPr>
-      <w:r>
-        <w:rPr>
-          <w:rFonts w:ascii="Times" w:hAnsi="Times" w:cs="Times"/>
-          <w:b/>
-          <w:sz w:val="36"/>
-        </w:rPr>
-        <w:t>Step 1: DDL Script Creation</w:t>
-      </w:r>
-    </w:p>
-    <w:p>
-      <w:pPr>
-        <w:spacing w:after="240"/>
-      </w:pPr>
-      <w:r>
-        <w:rPr>
-          <w:rFonts w:ascii="Times" w:hAnsi="Times" w:cs="Times"/>
-        </w:rPr>
-        <w:t>A comprehensive Data Definition Language (DDL) script was created to generate the 7 core tables derived from our finalized normalized schema.</w:t>
-      </w:r>
-    </w:p>
-    <w:p>
-      <w:pPr>
-        <w:spacing w:after="280"/>
-      </w:pPr>
-      <w:r>
-        <w:rPr>
-          <w:rFonts w:ascii="Times" w:hAnsi="Times" w:cs="Times"/>
-          <w:b/>
-          <w:sz w:val="28"/>
-        </w:rPr>
-        <w:t>Constraints Implemented:</w:t>
-      </w:r>
-    </w:p>
-    <w:p>
-      <w:pPr>
-        <w:ind w:left="720"/>
-      </w:pPr>
-      <w:r>
-        <w:rPr>
-          <w:rFonts w:ascii="Times" w:hAnsi="Times" w:cs="Times"/>
-          <w:b/>
+        <w:t xml:space="preserve"> table to </w:t>
+      </w:r>
+      <w:r>
+        <w:rPr>
+          <w:rFonts w:ascii="Times" w:hAnsi="Times" w:cs="Times"/>
         </w:rPr>
         <w:lastRenderedPageBreak/>
-        <w:tab/>
-        <w:t>•</w:t>
-      </w:r>
-      <w:r>
-        <w:rPr>
-          <w:rFonts w:ascii="Times" w:hAnsi="Times" w:cs="Times"/>
-          <w:b/>
-        </w:rPr>
-        <w:tab/>
-        <w:t>Primary Keys (PRIMARY KEY)</w:t>
-      </w:r>
-      <w:r>
-        <w:rPr>
-          <w:rFonts w:ascii="Times" w:hAnsi="Times" w:cs="Times"/>
-        </w:rPr>
-        <w:t xml:space="preserve">: Applied to all tables. A composite primary key is correctly utilized in the </w:t>
-      </w:r>
-      <w:r>
-        <w:rPr>
-          <w:rFonts w:ascii="Courier" w:hAnsi="Courier" w:cs="Courier"/>
-          <w:sz w:val="26"/>
-        </w:rPr>
-        <w:t>SERVICE_PARTS</w:t>
-      </w:r>
-      <w:r>
-        <w:rPr>
-          <w:rFonts w:ascii="Times" w:hAnsi="Times" w:cs="Times"/>
-        </w:rPr>
-        <w:t xml:space="preserve"> junction table (</w:t>
-      </w:r>
-      <w:r>
-        <w:rPr>
-          <w:rFonts w:ascii="Courier" w:hAnsi="Courier" w:cs="Courier"/>
-          <w:sz w:val="26"/>
-        </w:rPr>
-        <w:t>JobID</w:t>
-      </w:r>
-      <w:r>
-        <w:rPr>
-          <w:rFonts w:ascii="Times" w:hAnsi="Times" w:cs="Times"/>
-        </w:rPr>
-        <w:t xml:space="preserve">, </w:t>
-      </w:r>
-      <w:r>
-        <w:rPr>
-          <w:rFonts w:ascii="Courier" w:hAnsi="Courier" w:cs="Courier"/>
-          <w:sz w:val="26"/>
-        </w:rPr>
-        <w:t>PartID</w:t>
-      </w:r>
-      <w:r>
-        <w:rPr>
-          <w:rFonts w:ascii="Times" w:hAnsi="Times" w:cs="Times"/>
-        </w:rPr>
-        <w:t>).</w:t>
-      </w:r>
-    </w:p>
-    <w:p>
-      <w:pPr>
-        <w:ind w:left="720"/>
-      </w:pPr>
-      <w:r>
-        <w:rPr>
-          <w:rFonts w:ascii="Times" w:hAnsi="Times" w:cs="Times"/>
-          <w:b/>
-        </w:rPr>
-        <w:tab/>
-        <w:t>•</w:t>
-      </w:r>
-      <w:r>
-        <w:rPr>
-          <w:rFonts w:ascii="Times" w:hAnsi="Times" w:cs="Times"/>
-          <w:b/>
-        </w:rPr>
-        <w:tab/>
-        <w:t>Foreign Keys (FOREIGN KEY)</w:t>
-      </w:r>
-      <w:r>
-        <w:rPr>
-          <w:rFonts w:ascii="Times" w:hAnsi="Times" w:cs="Times"/>
-        </w:rPr>
-        <w:t xml:space="preserve">: Defined explicit relational mapping between tables ensuring referential integrity. </w:t>
-      </w:r>
-      <w:r>
-        <w:rPr>
-          <w:rFonts w:ascii="Courier" w:hAnsi="Courier" w:cs="Courier"/>
-          <w:sz w:val="26"/>
-        </w:rPr>
-        <w:t>ON DELETE CASCADE</w:t>
-      </w:r>
-      <w:r>
-        <w:rPr>
-          <w:rFonts w:ascii="Times" w:hAnsi="Times" w:cs="Times"/>
-        </w:rPr>
-        <w:t xml:space="preserve"> is utilized for parent-child relations like Customer-to-Vehicle. </w:t>
-      </w:r>
-      <w:r>
-        <w:rPr>
-          <w:rFonts w:ascii="Courier" w:hAnsi="Courier" w:cs="Courier"/>
-          <w:sz w:val="26"/>
-        </w:rPr>
-        <w:t>ON DELETE RESTRICT</w:t>
-      </w:r>
-      <w:r>
-        <w:rPr>
-          <w:rFonts w:ascii="Times" w:hAnsi="Times" w:cs="Times"/>
-        </w:rPr>
-        <w:t xml:space="preserve"> is used to prevent the accidental deletion of active Mechanics or Spare Parts.</w:t>
-      </w:r>
-    </w:p>
-    <w:p>
-      <w:pPr>
-        <w:ind w:left="720"/>
-      </w:pPr>
-      <w:r>
-        <w:rPr>
-          <w:rFonts w:ascii="Times" w:hAnsi="Times" w:cs="Times"/>
-          <w:b/>
-        </w:rPr>
-        <w:tab/>
-        <w:t>•</w:t>
-      </w:r>
-      <w:r>
-        <w:rPr>
-          <w:rFonts w:ascii="Times" w:hAnsi="Times" w:cs="Times"/>
-          <w:b/>
-        </w:rPr>
-        <w:tab/>
-        <w:t>Data Integrity (NOT NULL)</w:t>
-      </w:r>
-      <w:r>
-        <w:rPr>
-          <w:rFonts w:ascii="Times" w:hAnsi="Times" w:cs="Times"/>
-        </w:rPr>
-        <w:t xml:space="preserve">: Applied to core data points such as </w:t>
-      </w:r>
-      <w:r>
-        <w:rPr>
-          <w:rFonts w:ascii="Courier" w:hAnsi="Courier" w:cs="Courier"/>
-          <w:sz w:val="26"/>
-        </w:rPr>
-        <w:t>FirstName</w:t>
-      </w:r>
-      <w:r>
-        <w:rPr>
-          <w:rFonts w:ascii="Times" w:hAnsi="Times" w:cs="Times"/>
-        </w:rPr>
-        <w:t xml:space="preserve">, </w:t>
-      </w:r>
-      <w:r>
-        <w:rPr>
-          <w:rFonts w:ascii="Courier" w:hAnsi="Courier" w:cs="Courier"/>
-          <w:sz w:val="26"/>
-        </w:rPr>
-        <w:t>Date</w:t>
-      </w:r>
-      <w:r>
-        <w:rPr>
-          <w:rFonts w:ascii="Times" w:hAnsi="Times" w:cs="Times"/>
-        </w:rPr>
-        <w:t xml:space="preserve">, and </w:t>
-      </w:r>
-      <w:r>
-        <w:rPr>
-          <w:rFonts w:ascii="Courier" w:hAnsi="Courier" w:cs="Courier"/>
-          <w:sz w:val="26"/>
-        </w:rPr>
-        <w:t>Status</w:t>
-      </w:r>
-      <w:r>
-        <w:rPr>
-          <w:rFonts w:ascii="Times" w:hAnsi="Times" w:cs="Times"/>
-        </w:rPr>
-        <w:t>.</w:t>
-      </w:r>
-    </w:p>
-    <w:p>
-      <w:pPr>
-        <w:ind w:left="720"/>
-      </w:pPr>
-      <w:r>
-        <w:rPr>
-          <w:rFonts w:ascii="Times" w:hAnsi="Times" w:cs="Times"/>
-          <w:b/>
-        </w:rPr>
-        <w:tab/>
-        <w:t>•</w:t>
-      </w:r>
-      <w:r>
-        <w:rPr>
-          <w:rFonts w:ascii="Times" w:hAnsi="Times" w:cs="Times"/>
-          <w:b/>
-        </w:rPr>
-        <w:tab/>
-        <w:t>Unique Constraints (UNIQUE)</w:t>
-      </w:r>
-      <w:r>
-        <w:rPr>
-          <w:rFonts w:ascii="Times" w:hAnsi="Times" w:cs="Times"/>
-        </w:rPr>
-        <w:t xml:space="preserve">: Applied to </w:t>
-      </w:r>
-      <w:r>
-        <w:rPr>
-          <w:rFonts w:ascii="Courier" w:hAnsi="Courier" w:cs="Courier"/>
-          <w:sz w:val="26"/>
-        </w:rPr>
-        <w:t>Email</w:t>
-      </w:r>
-      <w:r>
-        <w:rPr>
-          <w:rFonts w:ascii="Times" w:hAnsi="Times" w:cs="Times"/>
-        </w:rPr>
-        <w:t xml:space="preserve"> (Customer) and </w:t>
-      </w:r>
-      <w:r>
-        <w:rPr>
-          <w:rFonts w:ascii="Courier" w:hAnsi="Courier" w:cs="Courier"/>
-          <w:sz w:val="26"/>
-        </w:rPr>
-        <w:t>RegNo</w:t>
-      </w:r>
-      <w:r>
-        <w:rPr>
-          <w:rFonts w:ascii="Times" w:hAnsi="Times" w:cs="Times"/>
-        </w:rPr>
-        <w:t xml:space="preserve"> (Vehicle) to ensure no duplicate entries exist in the system.</w:t>
-      </w:r>
-    </w:p>
-    <w:p>
-      <w:pPr>
-        <w:ind w:left="720"/>
-      </w:pPr>
-      <w:r>
-        <w:rPr>
-          <w:rFonts w:ascii="Times" w:hAnsi="Times" w:cs="Times"/>
-          <w:b/>
-        </w:rPr>
-        <w:tab/>
-        <w:t>•</w:t>
-      </w:r>
-      <w:r>
-        <w:rPr>
-          <w:rFonts w:ascii="Times" w:hAnsi="Times" w:cs="Times"/>
-          <w:b/>
-        </w:rPr>
-        <w:tab/>
-        <w:t>Check Constraints (CHECK)</w:t>
-      </w:r>
-      <w:r>
-        <w:rPr>
-          <w:rFonts w:ascii="Times" w:hAnsi="Times" w:cs="Times"/>
-        </w:rPr>
-        <w:t>: Added robust domain validations.</w:t>
-      </w:r>
-    </w:p>
-    <w:p>
-      <w:pPr>
-        <w:ind w:left="1440"/>
-      </w:pPr>
-      <w:r>
-        <w:rPr>
-          <w:rFonts w:ascii="Courier" w:hAnsi="Courier" w:cs="Courier"/>
-          <w:sz w:val="26"/>
-        </w:rPr>
-        <w:tab/>
-        <w:t>◦</w:t>
-      </w:r>
-      <w:r>
-        <w:rPr>
-          <w:rFonts w:ascii="Courier" w:hAnsi="Courier" w:cs="Courier"/>
-          <w:sz w:val="26"/>
-        </w:rPr>
-        <w:tab/>
-        <w:t>SkillLevel</w:t>
-      </w:r>
-      <w:r>
-        <w:rPr>
-          <w:rFonts w:ascii="Times" w:hAnsi="Times" w:cs="Times"/>
-        </w:rPr>
-        <w:t xml:space="preserve"> in Mechanics must be 'Junior', 'Intermediate', 'Senior', or 'Master'.</w:t>
-      </w:r>
-    </w:p>
-    <w:p>
-      <w:pPr>
-        <w:ind w:left="1440"/>
-      </w:pPr>
-      <w:r>
-        <w:rPr>
-          <w:rFonts w:ascii="Courier" w:hAnsi="Courier" w:cs="Courier"/>
-          <w:sz w:val="26"/>
-        </w:rPr>
-        <w:tab/>
-        <w:t>◦</w:t>
-      </w:r>
-      <w:r>
-        <w:rPr>
-          <w:rFonts w:ascii="Courier" w:hAnsi="Courier" w:cs="Courier"/>
-          <w:sz w:val="26"/>
-        </w:rPr>
-        <w:tab/>
-        <w:t>Status</w:t>
-      </w:r>
-      <w:r>
-        <w:rPr>
-          <w:rFonts w:ascii="Times" w:hAnsi="Times" w:cs="Times"/>
-        </w:rPr>
-        <w:t xml:space="preserve"> in Service_Job must be 'Pending', 'In Progress', 'Completed', or 'Cancelled'.</w:t>
-      </w:r>
-    </w:p>
-    <w:p>
-      <w:pPr>
-        <w:ind w:left="1440"/>
-      </w:pPr>
-      <w:r>
-        <w:rPr>
-          <w:rFonts w:ascii="Times" w:hAnsi="Times" w:cs="Times"/>
-        </w:rPr>
-        <w:tab/>
-        <w:t>◦</w:t>
-      </w:r>
-      <w:r>
-        <w:rPr>
-          <w:rFonts w:ascii="Times" w:hAnsi="Times" w:cs="Times"/>
-        </w:rPr>
-        <w:tab/>
-        <w:t>Monetary values (</w:t>
-      </w:r>
-      <w:r>
-        <w:rPr>
-          <w:rFonts w:ascii="Courier" w:hAnsi="Courier" w:cs="Courier"/>
-          <w:sz w:val="26"/>
-        </w:rPr>
-        <w:t>LaborCost</w:t>
-      </w:r>
-      <w:r>
-        <w:rPr>
-          <w:rFonts w:ascii="Times" w:hAnsi="Times" w:cs="Times"/>
-        </w:rPr>
-        <w:t xml:space="preserve">, </w:t>
-      </w:r>
-      <w:r>
-        <w:rPr>
-          <w:rFonts w:ascii="Courier" w:hAnsi="Courier" w:cs="Courier"/>
-          <w:sz w:val="26"/>
-        </w:rPr>
-        <w:t>UnitPrice</w:t>
-      </w:r>
-      <w:r>
-        <w:rPr>
-          <w:rFonts w:ascii="Times" w:hAnsi="Times" w:cs="Times"/>
-        </w:rPr>
-        <w:t xml:space="preserve">) and </w:t>
-      </w:r>
-      <w:r>
-        <w:rPr>
-          <w:rFonts w:ascii="Courier" w:hAnsi="Courier" w:cs="Courier"/>
-          <w:sz w:val="26"/>
-        </w:rPr>
-        <w:t>Quantity</w:t>
-      </w:r>
-      <w:r>
-        <w:rPr>
-          <w:rFonts w:ascii="Times" w:hAnsi="Times" w:cs="Times"/>
-        </w:rPr>
-        <w:t xml:space="preserve"> strictly enforce zero or positive constraints.</w:t>
-      </w:r>
-    </w:p>
-    <w:p>
-      <w:pPr>
-        <w:spacing w:after="280"/>
-      </w:pPr>
-      <w:r>
-        <w:rPr>
-          <w:rFonts w:ascii="Times" w:hAnsi="Times" w:cs="Times"/>
-          <w:b/>
-          <w:sz w:val="28"/>
-        </w:rPr>
-        <w:t>Indexing Implemented:</w:t>
-      </w:r>
-    </w:p>
-    <w:p>
-      <w:pPr>
-        <w:ind w:left="720"/>
-      </w:pPr>
-      <w:r>
-        <w:rPr>
-          <w:rFonts w:ascii="Times" w:hAnsi="Times" w:cs="Times"/>
-        </w:rPr>
-        <w:tab/>
-        <w:t>•</w:t>
-      </w:r>
-      <w:r>
-        <w:rPr>
-          <w:rFonts w:ascii="Times" w:hAnsi="Times" w:cs="Times"/>
-        </w:rPr>
-        <w:tab/>
-        <w:t>Indexes (</w:t>
-      </w:r>
-      <w:r>
-        <w:rPr>
-          <w:rFonts w:ascii="Courier" w:hAnsi="Courier" w:cs="Courier"/>
-          <w:sz w:val="26"/>
-        </w:rPr>
-        <w:t>CREATE INDEX</w:t>
-      </w:r>
-      <w:r>
-        <w:rPr>
-          <w:rFonts w:ascii="Times" w:hAnsi="Times" w:cs="Times"/>
-        </w:rPr>
-        <w:t>) have been explicitly declared for:</w:t>
-      </w:r>
-    </w:p>
-    <w:p>
-      <w:pPr>
-        <w:ind w:left="1440"/>
-      </w:pPr>
-      <w:r>
-        <w:rPr>
-          <w:rFonts w:ascii="Times" w:hAnsi="Times" w:cs="Times"/>
-        </w:rPr>
-        <w:tab/>
-        <w:t>◦</w:t>
-      </w:r>
-      <w:r>
-        <w:rPr>
-          <w:rFonts w:ascii="Times" w:hAnsi="Times" w:cs="Times"/>
-        </w:rPr>
-        <w:tab/>
-        <w:t>All Foreign Key columns to dramatically speed up join operations and cascaded deletes.</w:t>
-      </w:r>
-    </w:p>
-    <w:p>
-      <w:pPr>
-        <w:ind w:left="1440"/>
-      </w:pPr>
-      <w:r>
-        <w:rPr>
-          <w:rFonts w:ascii="Times" w:hAnsi="Times" w:cs="Times"/>
-        </w:rPr>
-        <w:tab/>
-        <w:t>◦</w:t>
-      </w:r>
-      <w:r>
-        <w:rPr>
-          <w:rFonts w:ascii="Times" w:hAnsi="Times" w:cs="Times"/>
-        </w:rPr>
-        <w:tab/>
-        <w:t xml:space="preserve">Frequently queried status fields (e.g., </w:t>
-      </w:r>
-      <w:r>
-        <w:rPr>
-          <w:rFonts w:ascii="Courier" w:hAnsi="Courier" w:cs="Courier"/>
-          <w:sz w:val="26"/>
-        </w:rPr>
-        <w:t>PaymentStatus</w:t>
-      </w:r>
-      <w:r>
-        <w:rPr>
-          <w:rFonts w:ascii="Times" w:hAnsi="Times" w:cs="Times"/>
-        </w:rPr>
-        <w:t xml:space="preserve">, </w:t>
-      </w:r>
-      <w:r>
-        <w:rPr>
-          <w:rFonts w:ascii="Courier" w:hAnsi="Courier" w:cs="Courier"/>
-          <w:sz w:val="26"/>
-        </w:rPr>
-        <w:t>Status</w:t>
-      </w:r>
-      <w:r>
-        <w:rPr>
-          <w:rFonts w:ascii="Times" w:hAnsi="Times" w:cs="Times"/>
-        </w:rPr>
-        <w:t>).</w:t>
-      </w:r>
-    </w:p>
-    <w:p>
-      <w:pPr>
-        <w:ind w:left="1440"/>
-      </w:pPr>
-      <w:r>
-        <w:rPr>
-          <w:rFonts w:ascii="Times" w:hAnsi="Times" w:cs="Times"/>
-        </w:rPr>
-        <w:tab/>
-        <w:t>◦</w:t>
-      </w:r>
-      <w:r>
-        <w:rPr>
-          <w:rFonts w:ascii="Times" w:hAnsi="Times" w:cs="Times"/>
-        </w:rPr>
-        <w:tab/>
-        <w:t xml:space="preserve">Common lookup fields like </w:t>
-      </w:r>
-      <w:r>
-        <w:rPr>
-          <w:rFonts w:ascii="Courier" w:hAnsi="Courier" w:cs="Courier"/>
-          <w:sz w:val="26"/>
-        </w:rPr>
-        <w:t>Email</w:t>
-      </w:r>
-      <w:r>
-        <w:rPr>
-          <w:rFonts w:ascii="Times" w:hAnsi="Times" w:cs="Times"/>
-        </w:rPr>
-        <w:t xml:space="preserve">, </w:t>
-      </w:r>
-      <w:r>
-        <w:rPr>
-          <w:rFonts w:ascii="Courier" w:hAnsi="Courier" w:cs="Courier"/>
-          <w:sz w:val="26"/>
-        </w:rPr>
-        <w:t>RegNo</w:t>
-      </w:r>
-      <w:r>
-        <w:rPr>
-          <w:rFonts w:ascii="Times" w:hAnsi="Times" w:cs="Times"/>
-        </w:rPr>
-        <w:t xml:space="preserve">, and </w:t>
-      </w:r>
-      <w:r>
-        <w:rPr>
-          <w:rFonts w:ascii="Courier" w:hAnsi="Courier" w:cs="Courier"/>
-          <w:sz w:val="26"/>
-        </w:rPr>
-        <w:t>LastName</w:t>
-      </w:r>
-      <w:r>
-        <w:rPr>
-          <w:rFonts w:ascii="Times" w:hAnsi="Times" w:cs="Times"/>
-        </w:rPr>
-        <w:t>.</w:t>
-      </w:r>
-    </w:p>
-    <w:p>
-      <w:pPr>
-        <w:spacing w:after="298"/>
-      </w:pPr>
-      <w:r>
-        <w:rPr>
-          <w:rFonts w:ascii="Times" w:hAnsi="Times" w:cs="Times"/>
-          <w:b/>
-          <w:sz w:val="36"/>
-        </w:rPr>
-        <w:t>Step 2: Verification Process</w:t>
-      </w:r>
-    </w:p>
-    <w:p>
-      <w:pPr>
-        <w:spacing w:after="240"/>
-      </w:pPr>
-      <w:r>
-        <w:rPr>
-          <w:rFonts w:ascii="Times" w:hAnsi="Times" w:cs="Times"/>
-        </w:rPr>
-        <w:t>The script was structured specifically for full compatibility with MySQL Workbench, ready to be reverse-engineered into an EER Diagram.</w:t>
-      </w:r>
-    </w:p>
-    <w:p>
-      <w:pPr>
-        <w:spacing w:after="321"/>
-      </w:pPr>
-      <w:r>
-        <w:rPr>
-          <w:rFonts w:ascii="Times" w:hAnsi="Times" w:cs="Times"/>
-          <w:b/>
-          <w:sz w:val="48"/>
-        </w:rPr>
-        <w:t>Milestone 5: Data Population &amp; Validation</w:t>
-      </w:r>
-    </w:p>
-    <w:p>
-      <w:pPr>
-        <w:spacing w:after="298"/>
-      </w:pPr>
-      <w:r>
-        <w:rPr>
-          <w:rFonts w:ascii="Times" w:hAnsi="Times" w:cs="Times"/>
-          <w:b/>
-          <w:sz w:val="36"/>
-        </w:rPr>
-        <w:lastRenderedPageBreak/>
-        <w:t>Step 1: Data Loading (DML)</w:t>
-      </w:r>
-    </w:p>
-    <w:p>
-      <w:pPr>
-        <w:spacing w:after="240"/>
-      </w:pPr>
-      <w:r>
-        <w:rPr>
-          <w:rFonts w:ascii="Times" w:hAnsi="Times" w:cs="Times"/>
-        </w:rPr>
-        <w:t>A comprehensive Data Manipulation Language (DML) script was created.</w:t>
-      </w:r>
-    </w:p>
-    <w:p>
-      <w:pPr>
-        <w:ind w:left="720"/>
-      </w:pPr>
-      <w:r>
-        <w:rPr>
-          <w:rFonts w:ascii="Times" w:hAnsi="Times" w:cs="Times"/>
-        </w:rPr>
-        <w:tab/>
-        <w:t>•</w:t>
-      </w:r>
-      <w:r>
-        <w:rPr>
-          <w:rFonts w:ascii="Times" w:hAnsi="Times" w:cs="Times"/>
-        </w:rPr>
-        <w:tab/>
-        <w:t xml:space="preserve">We utilized standard </w:t>
-      </w:r>
-      <w:r>
-        <w:rPr>
-          <w:rFonts w:ascii="Courier" w:hAnsi="Courier" w:cs="Courier"/>
-          <w:sz w:val="26"/>
-        </w:rPr>
-        <w:t>INSERT INTO ... VALUES ...</w:t>
-      </w:r>
-      <w:r>
-        <w:rPr>
-          <w:rFonts w:ascii="Times" w:hAnsi="Times" w:cs="Times"/>
-        </w:rPr>
-        <w:t xml:space="preserve"> statements to bulk-insert the synthetic data generated in Milestone 3 directly into the respective MySQL tables.</w:t>
-      </w:r>
-    </w:p>
-    <w:p>
-      <w:pPr>
-        <w:ind w:left="720"/>
-      </w:pPr>
-      <w:r>
-        <w:rPr>
-          <w:rFonts w:ascii="Times" w:hAnsi="Times" w:cs="Times"/>
-        </w:rPr>
-        <w:tab/>
-        <w:t>•</w:t>
-      </w:r>
-      <w:r>
-        <w:rPr>
-          <w:rFonts w:ascii="Times" w:hAnsi="Times" w:cs="Times"/>
-        </w:rPr>
-        <w:tab/>
-        <w:t>This approach populates all 7 core tables with exactly 50 rows of realistic dummy data, avoiding common MySQL local file permission issues.</w:t>
-      </w:r>
-    </w:p>
-    <w:p>
-      <w:pPr>
-        <w:spacing w:after="298"/>
-      </w:pPr>
-      <w:r>
-        <w:rPr>
-          <w:rFonts w:ascii="Times" w:hAnsi="Times" w:cs="Times"/>
-          <w:b/>
-          <w:sz w:val="36"/>
-        </w:rPr>
-        <w:t>Step 2: DML Operations</w:t>
-      </w:r>
-    </w:p>
-    <w:p>
-      <w:pPr>
-        <w:spacing w:after="240"/>
-      </w:pPr>
-      <w:r>
-        <w:rPr>
-          <w:rFonts w:ascii="Times" w:hAnsi="Times" w:cs="Times"/>
-        </w:rPr>
-        <w:t>To demonstrate active database management, two explicit data manipulation operations were executed:</w:t>
-      </w:r>
-    </w:p>
-    <w:p>
-      <w:pPr>
-        <w:ind w:left="720"/>
-      </w:pPr>
-      <w:r>
-        <w:rPr>
-          <w:rFonts w:ascii="Times" w:hAnsi="Times" w:cs="Times"/>
-          <w:b/>
-        </w:rPr>
-        <w:tab/>
-        <w:t>•</w:t>
-      </w:r>
-      <w:r>
-        <w:rPr>
-          <w:rFonts w:ascii="Times" w:hAnsi="Times" w:cs="Times"/>
-          <w:b/>
-        </w:rPr>
-        <w:tab/>
-        <w:t>UPDATE Operation</w:t>
-      </w:r>
-      <w:r>
-        <w:rPr>
-          <w:rFonts w:ascii="Times" w:hAnsi="Times" w:cs="Times"/>
-        </w:rPr>
-        <w:t xml:space="preserve">: We included a </w:t>
-      </w:r>
-      <w:r>
-        <w:rPr>
-          <w:rFonts w:ascii="Courier" w:hAnsi="Courier" w:cs="Courier"/>
-          <w:sz w:val="26"/>
-        </w:rPr>
-        <w:t>WHERE</w:t>
-      </w:r>
-      <w:r>
-        <w:rPr>
-          <w:rFonts w:ascii="Times" w:hAnsi="Times" w:cs="Times"/>
-        </w:rPr>
-        <w:t xml:space="preserve"> clause condition to isolate specific rows. Specifically, we updated the </w:t>
-      </w:r>
-      <w:r>
-        <w:rPr>
-          <w:rFonts w:ascii="Courier" w:hAnsi="Courier" w:cs="Courier"/>
-          <w:sz w:val="26"/>
-        </w:rPr>
-        <w:t>SERVICE_JOB</w:t>
-      </w:r>
-      <w:r>
-        <w:rPr>
-          <w:rFonts w:ascii="Times" w:hAnsi="Times" w:cs="Times"/>
-        </w:rPr>
-        <w:t xml:space="preserve"> table to systematically increase the </w:t>
+        <w:t xml:space="preserve">systematically increase the </w:t>
       </w:r>
       <w:r>
         <w:rPr>

</xml_diff>